<commit_message>
continue to write the report
</commit_message>
<xml_diff>
--- a/reports/me_dox/report_larence_WIP.docx
+++ b/reports/me_dox/report_larence_WIP.docx
@@ -6,12 +6,188 @@
       <w:pPr>
         <w:pStyle w:val="aa"/>
         <w:spacing w:after="120"/>
+        <w:rPr>
+          <w:lang w:val="ru-RU"/>
+        </w:rPr>
       </w:pPr>
       <w:r>
         <w:rPr>
           <w:lang w:val="ru-RU"/>
         </w:rPr>
-        <w:t>ИМПУЛЬСА ЛОРЕНЦА</w:t>
+        <w:t xml:space="preserve">УТОЧНЕНИЕ РЯДА ОРПДЕЛЕНИЙ И ПОДХОДОВ К ПРОВЕДЕНИЮ ЧИСЛЕННЫХ ЭКСПЕРИМЕНТОВ </w:t>
+      </w:r>
+    </w:p>
+    <w:p>
+      <w:pPr>
+        <w:rPr>
+          <w:lang w:val="ru-RU"/>
+        </w:rPr>
+      </w:pPr>
+      <w:r>
+        <w:rPr>
+          <w:lang w:val="ru-RU"/>
+        </w:rPr>
+        <w:t>В рамках исследования рассматривается численная модель системы акустических векторных приёмников (АВП), предназначенной для оценки азимута</w:t>
+      </w:r>
+      <w:r>
+        <w:rPr>
+          <w:lang w:val="ru-RU"/>
+        </w:rPr>
+        <w:t xml:space="preserve"> прихода акустического сигнала.</w:t>
+      </w:r>
+    </w:p>
+    <w:p>
+      <w:pPr>
+        <w:rPr>
+          <w:lang w:val="ru-RU"/>
+        </w:rPr>
+      </w:pPr>
+      <w:r>
+        <w:rPr>
+          <w:lang w:val="ru-RU"/>
+        </w:rPr>
+        <w:t>В процессе разработки модели возникла необходимость уточнения ряда исходных определений и подходов к проведению численных экспериментов.</w:t>
+      </w:r>
+    </w:p>
+    <w:p>
+      <w:pPr>
+        <w:rPr>
+          <w:lang w:val="ru-RU"/>
+        </w:rPr>
+      </w:pPr>
+      <w:r>
+        <w:rPr>
+          <w:lang w:val="ru-RU"/>
+        </w:rPr>
+        <w:t>Данный отчёт предназначен для утвержения опредений и методов анализа.</w:t>
+      </w:r>
+    </w:p>
+    <w:p>
+      <w:pPr>
+        <w:rPr>
+          <w:lang w:val="ru-RU"/>
+        </w:rPr>
+      </w:pPr>
+    </w:p>
+    <w:p>
+      <w:pPr>
+        <w:rPr>
+          <w:b/>
+          <w:lang w:val="ru-RU"/>
+        </w:rPr>
+      </w:pPr>
+      <w:r>
+        <w:rPr>
+          <w:b/>
+          <w:lang w:val="ru-RU"/>
+        </w:rPr>
+        <w:t>1.</w:t>
+      </w:r>
+      <w:r>
+        <w:rPr>
+          <w:b/>
+          <w:lang w:val="ru-RU"/>
+        </w:rPr>
+        <w:t xml:space="preserve"> Воспроизводимость численных экспериментов. Метод Common Random Numbers (CRN)</w:t>
+      </w:r>
+    </w:p>
+    <w:p>
+      <w:pPr>
+        <w:rPr>
+          <w:lang w:val="ru-RU"/>
+        </w:rPr>
+      </w:pPr>
+      <w:r>
+        <w:rPr>
+          <w:lang w:val="ru-RU"/>
+        </w:rPr>
+        <w:t>Для обеспечения воспроизводимости и сопоставимости результатов используетс</w:t>
+      </w:r>
+      <w:r>
+        <w:rPr>
+          <w:lang w:val="ru-RU"/>
+        </w:rPr>
+        <w:t>я метод общих случайных чисел (</w:t>
+      </w:r>
+      <w:r>
+        <w:rPr>
+          <w:lang w:val="ru-RU"/>
+        </w:rPr>
+        <w:t>Common Random Nu</w:t>
+      </w:r>
+      <w:r>
+        <w:rPr>
+          <w:lang w:val="ru-RU"/>
+        </w:rPr>
+        <w:t xml:space="preserve">mbers, CRN). </w:t>
+      </w:r>
+      <w:r>
+        <w:rPr>
+          <w:lang w:val="ru-RU"/>
+        </w:rPr>
+        <w:t>Суть метода заключается в использовании одинаковых исходных псевдослучайных последовательностей при сравнении различных условий моделирования.</w:t>
+      </w:r>
+      <w:r>
+        <w:rPr>
+          <w:lang w:val="ru-RU"/>
+        </w:rPr>
+        <w:t xml:space="preserve"> То есть для одних и тех же значений </w:t>
+      </w:r>
+      <w:r>
+        <w:rPr>
+          <w:i/>
+        </w:rPr>
+        <w:t>seed</w:t>
+      </w:r>
+      <w:r>
+        <w:rPr>
+          <w:lang w:val="ru-RU"/>
+        </w:rPr>
+        <w:t>, кооторые заают начальное внутреннее состояние генератора , будет один и тот же воспроизводимый  результат</w:t>
+      </w:r>
+      <w:r>
+        <w:rPr>
+          <w:lang w:val="ru-RU"/>
+        </w:rPr>
+        <w:t>.</w:t>
+      </w:r>
+    </w:p>
+    <w:p>
+      <w:pPr>
+        <w:rPr>
+          <w:lang w:val="ru-RU"/>
+        </w:rPr>
+      </w:pPr>
+      <w:r>
+        <w:rPr>
+          <w:lang w:val="ru-RU"/>
+        </w:rPr>
+        <w:t>В программной реализации перед расчётом каждой точки исследуемой зависимости генератор случайных чисел повторно инициализируетс</w:t>
+      </w:r>
+      <w:r>
+        <w:rPr>
+          <w:lang w:val="ru-RU"/>
+        </w:rPr>
+        <w:t xml:space="preserve">я фиксированным значением </w:t>
+      </w:r>
+      <w:r>
+        <w:rPr>
+          <w:i/>
+          <w:lang w:val="ru-RU"/>
+        </w:rPr>
+        <w:t>seed</w:t>
+      </w:r>
+      <w:r>
+        <w:rPr>
+          <w:lang w:val="ru-RU"/>
+        </w:rPr>
+        <w:t xml:space="preserve">. При этом внутри каждой точки формируются </w:t>
+      </w:r>
+      <w:r>
+        <w:rPr>
+          <w:i/>
+        </w:rPr>
+        <w:t>K</w:t>
       </w:r>
       <w:r>
         <w:rPr>
@@ -23,14 +199,63 @@
         <w:rPr>
           <w:lang w:val="ru-RU"/>
         </w:rPr>
-        <w:t xml:space="preserve">ДЛЯ ЗАДАЧИ АВП РЕШЕТКИ </w:t>
-      </w:r>
-      <w:bookmarkStart w:id="0" w:name="_GoBack"/>
-      <w:bookmarkEnd w:id="0"/>
+        <w:t>различных реализаций шума.</w:t>
+      </w:r>
+      <w:r>
+        <w:rPr>
+          <w:lang w:val="ru-RU"/>
+        </w:rPr>
+        <w:t xml:space="preserve"> </w:t>
+      </w:r>
+      <w:r>
+        <w:rPr>
+          <w:lang w:val="ru-RU"/>
+        </w:rPr>
+        <w:t>И для каждого из трёх каналов АВП соотвествует отдельный дочерний генератор случайных чисел, что удовлетворяет условию некоррелируемости шумов.</w:t>
+      </w:r>
+    </w:p>
+    <w:p>
+      <w:pPr>
+        <w:rPr>
+          <w:lang w:val="ru-RU"/>
+        </w:rPr>
+      </w:pPr>
+      <w:r>
+        <w:rPr>
+          <w:lang w:val="ru-RU"/>
+        </w:rPr>
+        <w:t>Такой подход позволяет исключить неконтролируемую смену исходных случайных последовательностей при изменении исследуемого параметра и при определённых условиях снизить дисперсию разности сравниваемых статистических оценок.</w:t>
+      </w:r>
+    </w:p>
+    <w:p>
+      <w:pPr>
+        <w:rPr>
+          <w:lang w:val="ru-RU"/>
+        </w:rPr>
+      </w:pPr>
+      <w:r>
+        <w:rPr>
+          <w:lang w:val="ru-RU"/>
+        </w:rPr>
+        <w:t>Этот подход особенно интерсен при исследовании зависимости</w:t>
+      </w:r>
+      <w:r>
+        <w:rPr>
+          <w:lang w:val="ru-RU"/>
+        </w:rPr>
+        <w:t xml:space="preserve"> </w:t>
+      </w:r>
+      <w:r>
+        <w:rPr>
+          <w:lang w:val="ru-RU"/>
+        </w:rPr>
+        <w:t>дисперсии ошибки оценки от истииного азимута. То есть для каждого угла будут одинаковые условия изиерения угла прихода.</w:t>
+      </w:r>
     </w:p>
     <w:p>
       <w:pPr>
         <w:pStyle w:val="21"/>
+        <w:ind w:firstLine="709"/>
         <w:rPr>
           <w:lang w:val="ru-RU"/>
         </w:rPr>
@@ -39,7 +264,8 @@
         <w:rPr>
           <w:lang w:val="ru-RU"/>
         </w:rPr>
-        <w:t>1</w:t>
+        <w:lastRenderedPageBreak/>
+        <w:t>2</w:t>
       </w:r>
       <w:r>
         <w:rPr>
@@ -64,33 +290,408 @@
         <w:rPr>
           <w:lang w:val="ru-RU"/>
         </w:rPr>
-        <w:t xml:space="preserve">Отношение </w:t>
-      </w:r>
-      <w:r>
-        <w:rPr>
-          <w:lang w:val="ru-RU"/>
-        </w:rPr>
-        <w:t>сигнала к шуму</w:t>
-      </w:r>
-      <w:r>
-        <w:rPr>
-          <w:lang w:val="ru-RU"/>
-        </w:rPr>
-        <w:t xml:space="preserve"> зададим</w:t>
-      </w:r>
-      <w:r>
-        <w:rPr>
-          <w:lang w:val="ru-RU"/>
-        </w:rPr>
-        <w:t xml:space="preserve"> через энергию сигнала и математическое ожидание энергии шума на одном интервале наблюдения</w:t>
-      </w:r>
+        <w:t>В изначальной постановки задачи отношение сигнал</w:t>
+      </w:r>
+      <w:r>
+        <w:rPr>
+          <w:lang w:val="ru-RU"/>
+        </w:rPr>
+        <w:t>/</w:t>
+      </w:r>
+      <w:r>
+        <w:rPr>
+          <w:lang w:val="ru-RU"/>
+        </w:rPr>
+        <w:t>шум определялось по сдедующей формуле</w:t>
+      </w:r>
+      <w:r>
+        <w:rPr>
+          <w:lang w:val="ru-RU"/>
+        </w:rPr>
+        <w:t xml:space="preserve">: </w:t>
+      </w:r>
+    </w:p>
+    <w:p>
+      <w:pPr>
+        <w:rPr>
+          <w:lang w:val="ru-RU"/>
+        </w:rPr>
+      </w:pPr>
+      <m:oMathPara>
+        <m:oMath>
+          <m:eqArr>
+            <m:eqArrPr>
+              <m:maxDist m:val="1"/>
+              <m:ctrlPr>
+                <w:rPr>
+                  <w:rFonts w:ascii="Cambria Math" w:hAnsi="Cambria Math"/>
+                  <w:i/>
+                  <w:lang w:val="ru-RU"/>
+                </w:rPr>
+              </m:ctrlPr>
+            </m:eqArrPr>
+            <m:e>
+              <m:r>
+                <w:rPr>
+                  <w:rFonts w:ascii="Cambria Math" w:hAnsi="Cambria Math"/>
+                  <w:lang w:val="ru-RU"/>
+                </w:rPr>
+                <m:t xml:space="preserve">SNR= </m:t>
+              </m:r>
+              <m:f>
+                <m:fPr>
+                  <m:ctrlPr>
+                    <w:rPr>
+                      <w:rFonts w:ascii="Cambria Math" w:hAnsi="Cambria Math"/>
+                      <w:i/>
+                      <w:lang w:val="ru-RU"/>
+                    </w:rPr>
+                  </m:ctrlPr>
+                </m:fPr>
+                <m:num>
+                  <m:sSub>
+                    <m:sSubPr>
+                      <m:ctrlPr>
+                        <w:rPr>
+                          <w:rFonts w:ascii="Cambria Math" w:hAnsi="Cambria Math"/>
+                          <w:i/>
+                          <w:lang w:val="ru-RU"/>
+                        </w:rPr>
+                      </m:ctrlPr>
+                    </m:sSubPr>
+                    <m:e>
+                      <m:sSup>
+                        <m:sSupPr>
+                          <m:ctrlPr>
+                            <w:rPr>
+                              <w:rFonts w:ascii="Cambria Math" w:hAnsi="Cambria Math"/>
+                              <w:i/>
+                              <w:lang w:val="ru-RU"/>
+                            </w:rPr>
+                          </m:ctrlPr>
+                        </m:sSupPr>
+                        <m:e>
+                          <m:r>
+                            <w:rPr>
+                              <w:rFonts w:ascii="Cambria Math" w:hAnsi="Cambria Math"/>
+                              <w:lang w:val="ru-RU"/>
+                            </w:rPr>
+                            <m:t>A</m:t>
+                          </m:r>
+                        </m:e>
+                        <m:sup>
+                          <m:r>
+                            <w:rPr>
+                              <w:rFonts w:ascii="Cambria Math" w:hAnsi="Cambria Math"/>
+                              <w:lang w:val="ru-RU"/>
+                            </w:rPr>
+                            <m:t>2</m:t>
+                          </m:r>
+                        </m:sup>
+                      </m:sSup>
+                    </m:e>
+                    <m:sub>
+                      <m:r>
+                        <w:rPr>
+                          <w:rFonts w:ascii="Cambria Math" w:hAnsi="Cambria Math"/>
+                          <w:lang w:val="ru-RU"/>
+                        </w:rPr>
+                        <m:t>s</m:t>
+                      </m:r>
+                    </m:sub>
+                  </m:sSub>
+                </m:num>
+                <m:den>
+                  <m:sSub>
+                    <m:sSubPr>
+                      <m:ctrlPr>
+                        <w:rPr>
+                          <w:rFonts w:ascii="Cambria Math" w:hAnsi="Cambria Math"/>
+                          <w:i/>
+                          <w:lang w:val="ru-RU"/>
+                        </w:rPr>
+                      </m:ctrlPr>
+                    </m:sSubPr>
+                    <m:e>
+                      <m:sSup>
+                        <m:sSupPr>
+                          <m:ctrlPr>
+                            <w:rPr>
+                              <w:rFonts w:ascii="Cambria Math" w:hAnsi="Cambria Math"/>
+                              <w:i/>
+                              <w:lang w:val="ru-RU"/>
+                            </w:rPr>
+                          </m:ctrlPr>
+                        </m:sSupPr>
+                        <m:e>
+                          <m:r>
+                            <w:rPr>
+                              <w:rFonts w:ascii="Cambria Math" w:hAnsi="Cambria Math"/>
+                              <w:lang w:val="ru-RU"/>
+                            </w:rPr>
+                            <m:t>σ</m:t>
+                          </m:r>
+                        </m:e>
+                        <m:sup>
+                          <m:r>
+                            <w:rPr>
+                              <w:rFonts w:ascii="Cambria Math" w:hAnsi="Cambria Math"/>
+                              <w:lang w:val="ru-RU"/>
+                            </w:rPr>
+                            <m:t>2</m:t>
+                          </m:r>
+                        </m:sup>
+                      </m:sSup>
+                    </m:e>
+                    <m:sub>
+                      <m:r>
+                        <w:rPr>
+                          <w:rFonts w:ascii="Cambria Math" w:hAnsi="Cambria Math"/>
+                          <w:lang w:val="ru-RU"/>
+                        </w:rPr>
+                        <m:t>noise</m:t>
+                      </m:r>
+                    </m:sub>
+                  </m:sSub>
+                </m:den>
+              </m:f>
+              <m:r>
+                <w:rPr>
+                  <w:rFonts w:ascii="Cambria Math" w:hAnsi="Cambria Math"/>
+                  <w:lang w:val="ru-RU"/>
+                </w:rPr>
+                <m:t>#</m:t>
+              </m:r>
+              <m:d>
+                <m:dPr>
+                  <m:ctrlPr>
+                    <w:rPr>
+                      <w:rFonts w:ascii="Cambria Math" w:hAnsi="Cambria Math"/>
+                      <w:i/>
+                      <w:lang w:val="ru-RU"/>
+                    </w:rPr>
+                  </m:ctrlPr>
+                </m:dPr>
+                <m:e>
+                  <m:r>
+                    <w:rPr>
+                      <w:rFonts w:ascii="Cambria Math" w:hAnsi="Cambria Math"/>
+                      <w:lang w:val="ru-RU"/>
+                    </w:rPr>
+                    <m:t>1</m:t>
+                  </m:r>
+                </m:e>
+              </m:d>
+            </m:e>
+          </m:eqArr>
+        </m:oMath>
+      </m:oMathPara>
+    </w:p>
+    <w:p>
+      <w:pPr>
+        <w:rPr>
+          <w:lang w:val="ru-RU"/>
+        </w:rPr>
+      </w:pPr>
+      <m:oMath>
+        <m:sSub>
+          <m:sSubPr>
+            <m:ctrlPr>
+              <w:rPr>
+                <w:rFonts w:ascii="Cambria Math" w:hAnsi="Cambria Math"/>
+                <w:i/>
+                <w:lang w:val="ru-RU"/>
+              </w:rPr>
+            </m:ctrlPr>
+          </m:sSubPr>
+          <m:e>
+            <m:r>
+              <w:rPr>
+                <w:rFonts w:ascii="Cambria Math" w:hAnsi="Cambria Math"/>
+                <w:lang w:val="ru-RU"/>
+              </w:rPr>
+              <m:t>A</m:t>
+            </m:r>
+          </m:e>
+          <m:sub>
+            <m:r>
+              <w:rPr>
+                <w:rFonts w:ascii="Cambria Math" w:hAnsi="Cambria Math"/>
+                <w:lang w:val="ru-RU"/>
+              </w:rPr>
+              <m:t>s</m:t>
+            </m:r>
+          </m:sub>
+        </m:sSub>
+      </m:oMath>
+      <w:r>
+        <w:rPr>
+          <w:lang w:val="ru-RU"/>
+        </w:rPr>
+        <w:t xml:space="preserve">- </w:t>
+      </w:r>
+      <w:r>
+        <w:rPr>
+          <w:lang w:val="ru-RU"/>
+        </w:rPr>
+        <w:t>амплитуда сигнала</w:t>
+      </w:r>
+      <w:r>
+        <w:rPr>
+          <w:lang w:val="ru-RU"/>
+        </w:rPr>
+        <w:t xml:space="preserve">; </w:t>
+      </w:r>
+      <m:oMath>
+        <m:sSub>
+          <m:sSubPr>
+            <m:ctrlPr>
+              <w:rPr>
+                <w:rFonts w:ascii="Cambria Math" w:hAnsi="Cambria Math"/>
+                <w:i/>
+                <w:lang w:val="ru-RU"/>
+              </w:rPr>
+            </m:ctrlPr>
+          </m:sSubPr>
+          <m:e>
+            <m:sSup>
+              <m:sSupPr>
+                <m:ctrlPr>
+                  <w:rPr>
+                    <w:rFonts w:ascii="Cambria Math" w:hAnsi="Cambria Math"/>
+                    <w:i/>
+                    <w:lang w:val="ru-RU"/>
+                  </w:rPr>
+                </m:ctrlPr>
+              </m:sSupPr>
+              <m:e>
+                <m:r>
+                  <w:rPr>
+                    <w:rFonts w:ascii="Cambria Math" w:hAnsi="Cambria Math"/>
+                    <w:lang w:val="ru-RU"/>
+                  </w:rPr>
+                  <m:t>σ</m:t>
+                </m:r>
+              </m:e>
+              <m:sup>
+                <m:r>
+                  <w:rPr>
+                    <w:rFonts w:ascii="Cambria Math" w:hAnsi="Cambria Math"/>
+                    <w:lang w:val="ru-RU"/>
+                  </w:rPr>
+                  <m:t>2</m:t>
+                </m:r>
+              </m:sup>
+            </m:sSup>
+          </m:e>
+          <m:sub>
+            <m:r>
+              <w:rPr>
+                <w:rFonts w:ascii="Cambria Math" w:hAnsi="Cambria Math"/>
+                <w:lang w:val="ru-RU"/>
+              </w:rPr>
+              <m:t>noise</m:t>
+            </m:r>
+          </m:sub>
+        </m:sSub>
+      </m:oMath>
       <w:r>
         <w:rPr>
           <w:lang w:val="ru-RU"/>
         </w:rPr>
         <w:t xml:space="preserve"> </w:t>
       </w:r>
+      <w:r>
+        <w:rPr>
+          <w:lang w:val="ru-RU"/>
+        </w:rPr>
+        <w:t>–</w:t>
+      </w:r>
+      <w:r>
+        <w:rPr>
+          <w:lang w:val="ru-RU"/>
+        </w:rPr>
+        <w:t xml:space="preserve"> </w:t>
+      </w:r>
+      <w:r>
+        <w:rPr>
+          <w:lang w:val="ru-RU"/>
+        </w:rPr>
+        <w:t>диссперсия шума</w:t>
+      </w:r>
+      <w:r>
+        <w:rPr>
+          <w:lang w:val="ru-RU"/>
+        </w:rPr>
+        <w:t>;</w:t>
+      </w:r>
+    </w:p>
+    <w:p>
+      <w:pPr>
+        <w:rPr>
+          <w:lang w:val="ru-RU"/>
+        </w:rPr>
+      </w:pPr>
+      <w:r>
+        <w:rPr>
+          <w:lang w:val="ru-RU"/>
+        </w:rPr>
+        <w:t xml:space="preserve">Данное опреление имеет ограничение по применимости из-за разного определения амплитуды для периодических и импульсных сигналов. Для более универсального определения </w:t>
+      </w:r>
+      <w:r>
+        <w:rPr>
+          <w:lang w:val="ru-RU"/>
+        </w:rPr>
+        <w:t>зададим</w:t>
+      </w:r>
+      <w:r>
+        <w:rPr>
+          <w:lang w:val="ru-RU"/>
+        </w:rPr>
+        <w:t xml:space="preserve"> </w:t>
+      </w:r>
+      <w:r>
+        <w:t>SNR</w:t>
+      </w:r>
+      <w:r>
+        <w:rPr>
+          <w:lang w:val="ru-RU"/>
+        </w:rPr>
+        <w:t xml:space="preserve"> </w:t>
+      </w:r>
+      <w:r>
+        <w:rPr>
+          <w:lang w:val="ru-RU"/>
+        </w:rPr>
+        <w:t>через энергию сигнала и математическое ожидание энергии шума на одном интервале наблюдения</w:t>
+      </w:r>
+      <w:r>
+        <w:rPr>
+          <w:lang w:val="ru-RU"/>
+        </w:rPr>
+        <w:t xml:space="preserve"> </w:t>
+      </w:r>
       <m:oMath>
+        <m:r>
+          <w:rPr>
+            <w:rFonts w:ascii="Cambria Math" w:hAnsi="Cambria Math"/>
+          </w:rPr>
+          <m:t>t</m:t>
+        </m:r>
+        <m:r>
+          <w:rPr>
+            <w:rFonts w:ascii="Cambria Math" w:hAnsi="Cambria Math"/>
+            <w:lang w:val="ru-RU"/>
+          </w:rPr>
+          <m:t xml:space="preserve"> </m:t>
+        </m:r>
+        <m:r>
+          <w:rPr>
+            <w:rFonts w:ascii="Cambria Math" w:hAnsi="Cambria Math"/>
+            <w:lang w:val="ru-RU"/>
+          </w:rPr>
+          <m:t>∈</m:t>
+        </m:r>
         <m:d>
           <m:dPr>
             <m:begChr m:val="⌊"/>
@@ -283,14 +884,7 @@
                               <w:rFonts w:ascii="Cambria Math" w:hAnsi="Cambria Math"/>
                               <w:szCs w:val="28"/>
                             </w:rPr>
-                            <m:t>n</m:t>
-                          </m:r>
-                          <m:r>
-                            <w:rPr>
-                              <w:rFonts w:ascii="Cambria Math" w:hAnsi="Cambria Math"/>
-                              <w:szCs w:val="28"/>
-                            </w:rPr>
-                            <m:t>oise</m:t>
+                            <m:t>noise</m:t>
                           </m:r>
                         </m:sub>
                       </m:sSub>
@@ -433,14 +1027,7 @@
                       <w:rFonts w:ascii="Cambria Math" w:hAnsi="Cambria Math"/>
                       <w:szCs w:val="28"/>
                     </w:rPr>
-                    <m:t>T</m:t>
-                  </m:r>
-                  <m:r>
-                    <w:rPr>
-                      <w:rFonts w:ascii="Cambria Math" w:hAnsi="Cambria Math"/>
-                      <w:szCs w:val="28"/>
-                    </w:rPr>
-                    <m:t>∙</m:t>
+                    <m:t>T∙</m:t>
                   </m:r>
                   <m:sSup>
                     <m:sSupPr>
@@ -513,7 +1100,7 @@
                     <w:rPr>
                       <w:rFonts w:ascii="Cambria Math" w:hAnsi="Cambria Math"/>
                     </w:rPr>
-                    <m:t>1</m:t>
+                    <m:t>2</m:t>
                   </m:r>
                 </m:e>
               </m:d>
@@ -536,14 +1123,63 @@
         </w:rPr>
         <w:t xml:space="preserve"> </w:t>
       </w:r>
-      <w:r>
-        <w:t>σ</w:t>
-      </w:r>
-      <w:r>
-        <w:rPr>
-          <w:lang w:val="ru-RU"/>
-        </w:rPr>
-        <w:t xml:space="preserve">² — дисперсия </w:t>
+      <m:oMath>
+        <m:sSup>
+          <m:sSupPr>
+            <m:ctrlPr>
+              <w:rPr>
+                <w:rFonts w:ascii="Cambria Math" w:hAnsi="Cambria Math"/>
+              </w:rPr>
+            </m:ctrlPr>
+          </m:sSupPr>
+          <m:e>
+            <m:sSub>
+              <m:sSubPr>
+                <m:ctrlPr>
+                  <w:rPr>
+                    <w:rFonts w:ascii="Cambria Math" w:hAnsi="Cambria Math"/>
+                    <w:i/>
+                    <w:szCs w:val="28"/>
+                  </w:rPr>
+                </m:ctrlPr>
+              </m:sSubPr>
+              <m:e>
+                <m:r>
+                  <w:rPr>
+                    <w:rFonts w:ascii="Cambria Math" w:hAnsi="Cambria Math"/>
+                    <w:szCs w:val="28"/>
+                  </w:rPr>
+                  <m:t>σ</m:t>
+                </m:r>
+              </m:e>
+              <m:sub>
+                <m:r>
+                  <w:rPr>
+                    <w:rFonts w:ascii="Cambria Math" w:hAnsi="Cambria Math"/>
+                    <w:szCs w:val="28"/>
+                  </w:rPr>
+                  <m:t>noise</m:t>
+                </m:r>
+              </m:sub>
+            </m:sSub>
+          </m:e>
+          <m:sup>
+            <m:r>
+              <w:rPr>
+                <w:rFonts w:ascii="Cambria Math" w:hAnsi="Cambria Math"/>
+                <w:szCs w:val="28"/>
+                <w:lang w:val="ru-RU"/>
+              </w:rPr>
+              <m:t>2</m:t>
+            </m:r>
+          </m:sup>
+        </m:sSup>
+      </m:oMath>
+      <w:r>
+        <w:rPr>
+          <w:lang w:val="ru-RU"/>
+        </w:rPr>
+        <w:t xml:space="preserve"> — дисперсия </w:t>
       </w:r>
       <w:r>
         <w:rPr>
@@ -738,6 +1374,13 @@
           <w:szCs w:val="28"/>
           <w:lang w:val="ru-RU"/>
         </w:rPr>
+        <w:t xml:space="preserve"> на интервале наблюдения</w:t>
+      </w:r>
+      <w:r>
+        <w:rPr>
+          <w:szCs w:val="28"/>
+          <w:lang w:val="ru-RU"/>
+        </w:rPr>
         <w:t>.</w:t>
       </w:r>
     </w:p>
@@ -807,7 +1450,7 @@
         <w:rPr>
           <w:lang w:val="ru-RU"/>
         </w:rPr>
-        <w:t xml:space="preserve"> для импульсных сигналов</w:t>
+        <w:t>, имеющий смысл строго для импульсных сигналов</w:t>
       </w:r>
       <w:r>
         <w:rPr>
@@ -1005,7 +1648,7 @@
                     <w:rPr>
                       <w:rFonts w:ascii="Cambria Math" w:hAnsi="Cambria Math"/>
                     </w:rPr>
-                    <m:t>2</m:t>
+                    <m:t>3</m:t>
                   </m:r>
                 </m:e>
               </m:d>
@@ -1024,7 +1667,7 @@
     <w:p>
       <w:pPr>
         <w:keepLines/>
-        <w:spacing w:before="100" w:after="100" w:line="360" w:lineRule="auto"/>
+        <w:spacing w:line="360" w:lineRule="auto"/>
         <w:rPr>
           <w:szCs w:val="28"/>
           <w:lang w:val="ru-RU"/>
@@ -1079,7 +1722,7 @@
           <w:szCs w:val="28"/>
           <w:lang w:val="ru-RU"/>
         </w:rPr>
-        <w:t xml:space="preserve">долю энергии, которая приходится на интервал наблюдения. Этот параматр важно учитывать для корректного сопастовления значений </w:t>
+        <w:t xml:space="preserve">долю энергии, которая приходится на интервал наблюдения. Этот параматр важно учитывать для корректного  значений </w:t>
       </w:r>
       <w:r>
         <w:rPr>
@@ -1105,7 +1748,7 @@
     <w:p>
       <w:pPr>
         <w:keepLines/>
-        <w:spacing w:before="100" w:after="100" w:line="360" w:lineRule="auto"/>
+        <w:spacing w:line="360" w:lineRule="auto"/>
         <w:ind w:firstLine="0"/>
         <w:rPr>
           <w:szCs w:val="28"/>
@@ -1131,7 +1774,21 @@
           <w:szCs w:val="28"/>
           <w:lang w:val="ru-RU"/>
         </w:rPr>
-        <w:t xml:space="preserve"> и вычляеется </w:t>
+        <w:t xml:space="preserve"> и вычляеется</w:t>
+      </w:r>
+      <w:r>
+        <w:rPr>
+          <w:szCs w:val="28"/>
+          <w:lang w:val="ru-RU"/>
+        </w:rPr>
+        <w:t xml:space="preserve"> энергия сигнала</w:t>
+      </w:r>
+      <w:r>
+        <w:rPr>
+          <w:szCs w:val="28"/>
+          <w:lang w:val="ru-RU"/>
+        </w:rPr>
+        <w:t xml:space="preserve"> </w:t>
       </w:r>
       <m:oMath>
         <m:sSub>
@@ -1195,25 +1852,34 @@
           <w:szCs w:val="28"/>
           <w:lang w:val="ru-RU"/>
         </w:rPr>
-        <w:t xml:space="preserve">, которое передается в генератор случайных чисел для генрерации шума. </w:t>
-      </w:r>
-      <w:r>
-        <w:rPr>
-          <w:lang w:val="ru-RU"/>
-        </w:rPr>
-        <w:t>СКО</w:t>
-      </w:r>
-      <w:r>
-        <w:rPr>
-          <w:lang w:val="ru-RU"/>
-        </w:rPr>
-        <w:t xml:space="preserve"> шума </w:t>
-      </w:r>
-      <w:r>
-        <w:rPr>
-          <w:lang w:val="ru-RU"/>
-        </w:rPr>
-        <w:t>рассчитывается по формуле</w:t>
+        <w:t xml:space="preserve">, которое передается в генератор случайных чисел для </w:t>
+      </w:r>
+      <w:r>
+        <w:rPr>
+          <w:szCs w:val="28"/>
+          <w:lang w:val="ru-RU"/>
+        </w:rPr>
+        <w:t>создания</w:t>
+      </w:r>
+      <w:r>
+        <w:rPr>
+          <w:szCs w:val="28"/>
+          <w:lang w:val="ru-RU"/>
+        </w:rPr>
+        <w:t xml:space="preserve"> шума. </w:t>
+      </w:r>
+      <w:r>
+        <w:rPr>
+          <w:szCs w:val="28"/>
+          <w:lang w:val="ru-RU"/>
+        </w:rPr>
+        <w:t xml:space="preserve">Из формулы (2) сдедует </w:t>
+      </w:r>
+      <w:r>
+        <w:rPr>
+          <w:lang w:val="ru-RU"/>
+        </w:rPr>
+        <w:t>выражение</w:t>
       </w:r>
       <w:r>
         <w:rPr>
@@ -1347,14 +2013,7 @@
                           <w:rFonts w:ascii="Cambria Math" w:hAnsi="Cambria Math"/>
                           <w:szCs w:val="28"/>
                         </w:rPr>
-                        <m:t>T</m:t>
-                      </m:r>
-                      <m:r>
-                        <w:rPr>
-                          <w:rFonts w:ascii="Cambria Math" w:hAnsi="Cambria Math"/>
-                          <w:szCs w:val="28"/>
-                        </w:rPr>
-                        <m:t>∙</m:t>
+                        <m:t>T∙</m:t>
                       </m:r>
                       <m:r>
                         <m:rPr>
@@ -1401,6 +2060,7 @@
     <w:p>
       <w:pPr>
         <w:pStyle w:val="21"/>
+        <w:ind w:firstLine="709"/>
         <w:rPr>
           <w:lang w:val="ru-RU"/>
         </w:rPr>
@@ -1409,6 +2069,7 @@
         <w:rPr>
           <w:lang w:val="ru-RU"/>
         </w:rPr>
+        <w:lastRenderedPageBreak/>
         <w:t>2 Импульс и положение его центра</w:t>
       </w:r>
     </w:p>
@@ -1520,14 +2181,7 @@
                       <w:rFonts w:ascii="Cambria Math" w:hAnsi="Cambria Math"/>
                       <w:szCs w:val="28"/>
                     </w:rPr>
-                    <m:t>A</m:t>
-                  </m:r>
-                  <m:r>
-                    <w:rPr>
-                      <w:rFonts w:ascii="Cambria Math" w:hAnsi="Cambria Math"/>
-                      <w:szCs w:val="28"/>
-                    </w:rPr>
-                    <m:t>∙β</m:t>
+                    <m:t>A∙β</m:t>
                   </m:r>
                 </m:num>
                 <m:den>
@@ -1670,7 +2324,6 @@
           <w:szCs w:val="28"/>
           <w:lang w:val="ru-RU"/>
         </w:rPr>
-        <w:lastRenderedPageBreak/>
         <w:t xml:space="preserve"> </w:t>
       </w:r>
       <m:oMath>
@@ -2128,7 +2781,7 @@
                       </m:r>
                       <m:ctrlPr>
                         <w:rPr>
-                          <w:rFonts w:ascii="Cambria Math"/>
+                          <w:rFonts w:ascii="Cambria Math" w:hAnsi="Cambria Math"/>
                           <w:lang w:val="ru-RU"/>
                         </w:rPr>
                       </m:ctrlPr>
@@ -2300,7 +2953,17 @@
           <w:sz w:val="24"/>
           <w:lang w:val="ru-RU"/>
         </w:rPr>
-        <w:t xml:space="preserve">Рисунок 1 — Импульс Лоренца с центром </w:t>
+        <w:t xml:space="preserve">Рисунок 1 </w:t>
+      </w:r>
+      <w:bookmarkStart w:id="0" w:name="_GoBack"/>
+      <w:bookmarkEnd w:id="0"/>
+      <w:r>
+        <w:rPr>
+          <w:b w:val="0"/>
+          <w:sz w:val="24"/>
+          <w:lang w:val="ru-RU"/>
+        </w:rPr>
+        <w:t xml:space="preserve">— Импульс Лоренца с центром </w:t>
       </w:r>
       <w:r>
         <w:rPr>
@@ -3893,7 +4556,7 @@
       <w:rPr>
         <w:noProof/>
       </w:rPr>
-      <w:t>1</w:t>
+      <w:t>8</w:t>
     </w:r>
     <w:r>
       <w:fldChar w:fldCharType="end"/>
@@ -15859,7 +16522,7 @@
 </file>
 
 <file path=customXml/itemProps1.xml><?xml version="1.0" encoding="utf-8"?>
-<ds:datastoreItem xmlns:ds="http://schemas.openxmlformats.org/officeDocument/2006/customXml" ds:itemID="{7B078F8F-085B-496F-949B-795859783A70}">
+<ds:datastoreItem xmlns:ds="http://schemas.openxmlformats.org/officeDocument/2006/customXml" ds:itemID="{BDFBCCAB-6F06-49F1-BD26-B3FC1B744E2D}">
   <ds:schemaRefs>
     <ds:schemaRef ds:uri="http://schemas.openxmlformats.org/officeDocument/2006/bibliography"/>
   </ds:schemaRefs>

</xml_diff>

<commit_message>
Add rms_f, continue write dox report
</commit_message>
<xml_diff>
--- a/reports/me_dox/report_larence_WIP.docx
+++ b/reports/me_dox/report_larence_WIP.docx
@@ -14,7 +14,19 @@
         <w:rPr>
           <w:lang w:val="ru-RU"/>
         </w:rPr>
-        <w:t xml:space="preserve">УТОЧНЕНИЕ РЯДА ОРПДЕЛЕНИЙ И ПОДХОДОВ К ПРОВЕДЕНИЮ ЧИСЛЕННЫХ ЭКСПЕРИМЕНТОВ </w:t>
+        <w:t>УТОЧНЕНИЕ РЯДА ОРПДЕЛЕНИЙ И ПОДХОДОВ К ПРОВЕДЕНИЮ ЧИСЛЕННЫХ ЭКСПЕРИМЕНТОВ</w:t>
+      </w:r>
+      <w:r>
+        <w:rPr>
+          <w:lang w:val="ru-RU"/>
+        </w:rPr>
+        <w:t xml:space="preserve"> </w:t>
+      </w:r>
+      <w:r>
+        <w:rPr>
+          <w:lang w:val="ru-RU"/>
+        </w:rPr>
+        <w:t xml:space="preserve"> </w:t>
       </w:r>
     </w:p>
     <w:p>
@@ -27,13 +39,37 @@
         <w:rPr>
           <w:lang w:val="ru-RU"/>
         </w:rPr>
-        <w:t>В рамках исследования рассматривается численная модель системы акустических векторных приёмников (АВП), предназначенной для оценки азимута</w:t>
-      </w:r>
-      <w:r>
-        <w:rPr>
-          <w:lang w:val="ru-RU"/>
-        </w:rPr>
-        <w:t xml:space="preserve"> прихода акустического сигнала.</w:t>
+        <w:t xml:space="preserve">В рамках исследования рассматривается </w:t>
+      </w:r>
+      <w:r>
+        <w:rPr>
+          <w:lang w:val="ru-RU"/>
+        </w:rPr>
+        <w:t xml:space="preserve">упрощенная математическая </w:t>
+      </w:r>
+      <w:r>
+        <w:rPr>
+          <w:lang w:val="ru-RU"/>
+        </w:rPr>
+        <w:t>модель системы акустических векторных приёмников (АВП), предназначенной для оценки азимута</w:t>
+      </w:r>
+      <w:r>
+        <w:rPr>
+          <w:lang w:val="ru-RU"/>
+        </w:rPr>
+        <w:t xml:space="preserve"> прихода акустического сигнала</w:t>
+      </w:r>
+      <w:r>
+        <w:rPr>
+          <w:lang w:val="ru-RU"/>
+        </w:rPr>
+        <w:t xml:space="preserve">, не учитываяющая задержки прихода на датчиеи </w:t>
+      </w:r>
+      <w:r>
+        <w:rPr>
+          <w:lang w:val="ru-RU"/>
+        </w:rPr>
+        <w:t>.</w:t>
       </w:r>
     </w:p>
     <w:p>
@@ -59,39 +95,38 @@
         <w:rPr>
           <w:lang w:val="ru-RU"/>
         </w:rPr>
-        <w:t>Данный отчёт предназначен для утвержения опредений и методов анализа.</w:t>
+        <w:t>Данный отчёт предназначен для утвержен</w:t>
+      </w:r>
+      <w:r>
+        <w:rPr>
+          <w:lang w:val="ru-RU"/>
+        </w:rPr>
+        <w:t>ия опредений и методов анализа.</w:t>
       </w:r>
     </w:p>
     <w:p>
       <w:pPr>
         <w:rPr>
+          <w:b/>
           <w:lang w:val="ru-RU"/>
         </w:rPr>
       </w:pPr>
+      <w:r>
+        <w:rPr>
+          <w:b/>
+          <w:lang w:val="ru-RU"/>
+        </w:rPr>
+        <w:t>1. Воспроизводимость численных экспериментов. Метод Common Random Numbers (CRN)</w:t>
+      </w:r>
     </w:p>
     <w:p>
       <w:pPr>
         <w:rPr>
-          <w:b/>
           <w:lang w:val="ru-RU"/>
         </w:rPr>
       </w:pPr>
       <w:r>
         <w:rPr>
-          <w:b/>
-          <w:lang w:val="ru-RU"/>
-        </w:rPr>
-        <w:t>1. Воспроизводимость численных экспериментов. Метод Common Random Numbers (CRN)</w:t>
-      </w:r>
-    </w:p>
-    <w:p>
-      <w:pPr>
-        <w:rPr>
-          <w:lang w:val="ru-RU"/>
-        </w:rPr>
-      </w:pPr>
-      <w:r>
-        <w:rPr>
           <w:lang w:val="ru-RU"/>
         </w:rPr>
         <w:t>Для обеспечения воспроизводимости и сопоставимости результатов используетс</w:t>
@@ -136,7 +171,37 @@
         <w:rPr>
           <w:lang w:val="ru-RU"/>
         </w:rPr>
-        <w:t>, кооторые заают начальное внутреннее состояние генератора , будет один и тот же воспроизводимый  результат</w:t>
+        <w:t>, кооторые за</w:t>
+      </w:r>
+      <w:r>
+        <w:rPr>
+          <w:lang w:val="ru-RU"/>
+        </w:rPr>
+        <w:t>д</w:t>
+      </w:r>
+      <w:r>
+        <w:rPr>
+          <w:lang w:val="ru-RU"/>
+        </w:rPr>
+        <w:t>ают начальное в</w:t>
+      </w:r>
+      <w:r>
+        <w:rPr>
+          <w:lang w:val="ru-RU"/>
+        </w:rPr>
+        <w:t>нутреннее состояние генератора случайных чисел, будут одни и те же воспроизводимые</w:t>
+      </w:r>
+      <w:r>
+        <w:rPr>
+          <w:lang w:val="ru-RU"/>
+        </w:rPr>
+        <w:t xml:space="preserve">  результат</w:t>
+      </w:r>
+      <w:r>
+        <w:rPr>
+          <w:lang w:val="ru-RU"/>
+        </w:rPr>
+        <w:t>ы</w:t>
       </w:r>
       <w:r>
         <w:rPr>
@@ -950,7 +1015,7 @@
                               <w:rFonts w:ascii="Cambria Math" w:hAnsi="Cambria Math"/>
                               <w:szCs w:val="28"/>
                             </w:rPr>
-                            <m:t>P</m:t>
+                            <m:t>s</m:t>
                           </m:r>
                         </m:e>
                         <m:sup>
@@ -1341,7 +1406,16 @@
           <w:szCs w:val="28"/>
           <w:lang w:val="ru-RU"/>
         </w:rPr>
-        <w:t>энергия шума</w:t>
+        <w:t>энер</w:t>
+      </w:r>
+      <w:bookmarkStart w:id="0" w:name="_GoBack"/>
+      <w:bookmarkEnd w:id="0"/>
+      <w:r>
+        <w:rPr>
+          <w:szCs w:val="28"/>
+          <w:lang w:val="ru-RU"/>
+        </w:rPr>
+        <w:t>гия шума</w:t>
       </w:r>
       <w:r>
         <w:rPr>
@@ -1370,7 +1444,19 @@
         <w:rPr>
           <w:lang w:val="ru-RU"/>
         </w:rPr>
-        <w:t>Из опреления следует, что энергия</w:t>
+        <w:t>Из опреления</w:t>
+      </w:r>
+      <w:r>
+        <w:rPr>
+          <w:lang w:val="ru-RU"/>
+        </w:rPr>
+        <w:t xml:space="preserve"> (2)</w:t>
+      </w:r>
+      <w:r>
+        <w:rPr>
+          <w:lang w:val="ru-RU"/>
+        </w:rPr>
+        <w:t xml:space="preserve"> следует, что энергия</w:t>
       </w:r>
       <w:r>
         <w:rPr>
@@ -2040,6 +2126,9 @@
         </w:rPr>
       </w:pPr>
       <w:r>
+        <w:rPr>
+          <w:lang w:val="ru-RU"/>
+        </w:rPr>
         <w:lastRenderedPageBreak/>
         <w:t>3.</w:t>
       </w:r>
@@ -2047,7 +2136,19 @@
         <w:rPr>
           <w:lang w:val="ru-RU"/>
         </w:rPr>
-        <w:t xml:space="preserve"> Импульс и положение его центра</w:t>
+        <w:t xml:space="preserve"> Импульс</w:t>
+      </w:r>
+      <w:r>
+        <w:rPr>
+          <w:lang w:val="ru-RU"/>
+        </w:rPr>
+        <w:t xml:space="preserve"> Лоренца</w:t>
+      </w:r>
+      <w:r>
+        <w:rPr>
+          <w:lang w:val="ru-RU"/>
+        </w:rPr>
+        <w:t xml:space="preserve"> и положение его центра</w:t>
       </w:r>
     </w:p>
     <w:p>
@@ -2060,7 +2161,19 @@
         <w:rPr>
           <w:lang w:val="ru-RU"/>
         </w:rPr>
-        <w:t xml:space="preserve">На текущем этапе моделирования тесовым сигналом, который приходит на АВП, является </w:t>
+        <w:t xml:space="preserve">На текущем этапе моделирования тесовым сигналом, который приходит на АВП, </w:t>
+      </w:r>
+      <w:r>
+        <w:rPr>
+          <w:lang w:val="ru-RU"/>
+        </w:rPr>
+        <w:t>предложен</w:t>
+      </w:r>
+      <w:r>
+        <w:rPr>
+          <w:lang w:val="ru-RU"/>
+        </w:rPr>
+        <w:t xml:space="preserve"> </w:t>
       </w:r>
       <w:r>
         <w:rPr>
@@ -2114,7 +2227,7 @@
                   <w:rFonts w:ascii="Cambria Math" w:hAnsi="Cambria Math"/>
                   <w:szCs w:val="28"/>
                 </w:rPr>
-                <m:t>P</m:t>
+                <m:t>s</m:t>
               </m:r>
               <m:d>
                 <m:dPr>
@@ -2153,12 +2266,41 @@
                   </m:ctrlPr>
                 </m:fPr>
                 <m:num>
+                  <m:sSub>
+                    <m:sSubPr>
+                      <m:ctrlPr>
+                        <w:rPr>
+                          <w:rFonts w:ascii="Cambria Math" w:hAnsi="Cambria Math"/>
+                          <w:i/>
+                          <w:szCs w:val="28"/>
+                        </w:rPr>
+                      </m:ctrlPr>
+                    </m:sSubPr>
+                    <m:e>
+                      <m:r>
+                        <w:rPr>
+                          <w:rFonts w:ascii="Cambria Math" w:hAnsi="Cambria Math"/>
+                          <w:szCs w:val="28"/>
+                        </w:rPr>
+                        <m:t>A</m:t>
+                      </m:r>
+                    </m:e>
+                    <m:sub>
+                      <m:r>
+                        <w:rPr>
+                          <w:rFonts w:ascii="Cambria Math" w:hAnsi="Cambria Math"/>
+                          <w:szCs w:val="28"/>
+                        </w:rPr>
+                        <m:t>pulse</m:t>
+                      </m:r>
+                    </m:sub>
+                  </m:sSub>
                   <m:r>
                     <w:rPr>
                       <w:rFonts w:ascii="Cambria Math" w:hAnsi="Cambria Math"/>
                       <w:szCs w:val="28"/>
                     </w:rPr>
-                    <m:t>A∙β</m:t>
+                    <m:t>∙β</m:t>
                   </m:r>
                 </m:num>
                 <m:den>
@@ -2291,7 +2433,7 @@
     <w:p>
       <w:pPr>
         <w:keepLines/>
-        <w:spacing w:before="100" w:after="100" w:line="240" w:lineRule="auto"/>
+        <w:spacing w:before="100" w:after="100" w:line="360" w:lineRule="auto"/>
         <w:rPr>
           <w:lang w:val="ru-RU"/>
         </w:rPr>
@@ -2409,7 +2551,13 @@
         <w:rPr>
           <w:lang w:val="ru-RU"/>
         </w:rPr>
-        <w:t>длительность импульса</w:t>
+        <w:t xml:space="preserve">параматр, характерезующий длительность </w:t>
+      </w:r>
+      <w:r>
+        <w:rPr>
+          <w:lang w:val="ru-RU"/>
+        </w:rPr>
+        <w:t>импульса</w:t>
       </w:r>
       <w:r>
         <w:rPr>
@@ -2418,13 +2566,35 @@
         <w:t xml:space="preserve">; </w:t>
       </w:r>
       <m:oMath>
-        <m:r>
-          <w:rPr>
-            <w:rFonts w:ascii="Cambria Math" w:hAnsi="Cambria Math"/>
-            <w:lang w:val="ru-RU"/>
-          </w:rPr>
-          <m:t>A</m:t>
-        </m:r>
+        <m:sSub>
+          <m:sSubPr>
+            <m:ctrlPr>
+              <w:rPr>
+                <w:rFonts w:ascii="Cambria Math" w:hAnsi="Cambria Math"/>
+                <w:i/>
+                <w:szCs w:val="28"/>
+              </w:rPr>
+            </m:ctrlPr>
+          </m:sSubPr>
+          <m:e>
+            <m:r>
+              <w:rPr>
+                <w:rFonts w:ascii="Cambria Math" w:hAnsi="Cambria Math"/>
+                <w:szCs w:val="28"/>
+              </w:rPr>
+              <m:t>A</m:t>
+            </m:r>
+          </m:e>
+          <m:sub>
+            <m:r>
+              <w:rPr>
+                <w:rFonts w:ascii="Cambria Math" w:hAnsi="Cambria Math"/>
+                <w:szCs w:val="28"/>
+              </w:rPr>
+              <m:t>pulse</m:t>
+            </m:r>
+          </m:sub>
+        </m:sSub>
       </m:oMath>
       <w:r>
         <w:rPr>
@@ -2448,7 +2618,19 @@
         <w:rPr>
           <w:lang w:val="ru-RU"/>
         </w:rPr>
-        <w:t>амплитуда импульса</w:t>
+        <w:t>коэф</w:t>
+      </w:r>
+      <w:r>
+        <w:rPr>
+          <w:lang w:val="ru-RU"/>
+        </w:rPr>
+        <w:t>ф</w:t>
+      </w:r>
+      <w:r>
+        <w:rPr>
+          <w:lang w:val="ru-RU"/>
+        </w:rPr>
+        <w:t>ицент амлитудного маштабирования импульса</w:t>
       </w:r>
       <w:r>
         <w:rPr>
@@ -2617,7 +2799,7 @@
                   <w:rFonts w:ascii="Cambria Math" w:hAnsi="Cambria Math"/>
                   <w:szCs w:val="28"/>
                 </w:rPr>
-                <m:t>P</m:t>
+                <m:t>s</m:t>
               </m:r>
               <m:d>
                 <m:dPr>
@@ -2656,12 +2838,41 @@
                   </m:ctrlPr>
                 </m:fPr>
                 <m:num>
+                  <m:sSub>
+                    <m:sSubPr>
+                      <m:ctrlPr>
+                        <w:rPr>
+                          <w:rFonts w:ascii="Cambria Math" w:hAnsi="Cambria Math"/>
+                          <w:i/>
+                          <w:szCs w:val="28"/>
+                        </w:rPr>
+                      </m:ctrlPr>
+                    </m:sSubPr>
+                    <m:e>
+                      <m:r>
+                        <w:rPr>
+                          <w:rFonts w:ascii="Cambria Math" w:hAnsi="Cambria Math"/>
+                          <w:szCs w:val="28"/>
+                        </w:rPr>
+                        <m:t>A</m:t>
+                      </m:r>
+                    </m:e>
+                    <m:sub>
+                      <m:r>
+                        <w:rPr>
+                          <w:rFonts w:ascii="Cambria Math" w:hAnsi="Cambria Math"/>
+                          <w:szCs w:val="28"/>
+                        </w:rPr>
+                        <m:t>pulse</m:t>
+                      </m:r>
+                    </m:sub>
+                  </m:sSub>
                   <m:r>
                     <w:rPr>
                       <w:rFonts w:ascii="Cambria Math" w:hAnsi="Cambria Math"/>
                       <w:szCs w:val="28"/>
                     </w:rPr>
-                    <m:t>A∙β</m:t>
+                    <m:t>∙β</m:t>
                   </m:r>
                 </m:num>
                 <m:den>
@@ -2798,7 +3009,6 @@
         </m:oMath>
       </m:oMathPara>
     </w:p>
-    <w:p/>
     <w:p>
       <w:pPr>
         <w:rPr>
@@ -2815,6 +3025,92 @@
         <w:rPr>
           <w:lang w:val="ru-RU"/>
         </w:rPr>
+        <w:t xml:space="preserve">Лоренца </w:t>
+      </w:r>
+      <w:r>
+        <w:t>c</w:t>
+      </w:r>
+      <w:r>
+        <w:rPr>
+          <w:lang w:val="ru-RU"/>
+        </w:rPr>
+        <w:t xml:space="preserve"> </w:t>
+      </w:r>
+      <m:oMath>
+        <m:r>
+          <w:rPr>
+            <w:rFonts w:ascii="Cambria Math" w:hAnsi="Cambria Math"/>
+            <w:szCs w:val="28"/>
+          </w:rPr>
+          <m:t>β</m:t>
+        </m:r>
+      </m:oMath>
+      <w:r>
+        <w:rPr>
+          <w:lang w:val="ru-RU"/>
+        </w:rPr>
+        <w:t xml:space="preserve"> </w:t>
+      </w:r>
+      <w:r>
+        <w:rPr>
+          <w:lang w:val="ru-RU"/>
+        </w:rPr>
+        <w:t xml:space="preserve">= 0.05 </w:t>
+      </w:r>
+      <w:r>
+        <w:rPr>
+          <w:lang w:val="ru-RU"/>
+        </w:rPr>
+        <w:t xml:space="preserve">и </w:t>
+      </w:r>
+      <m:oMath>
+        <m:sSub>
+          <m:sSubPr>
+            <m:ctrlPr>
+              <w:rPr>
+                <w:rFonts w:ascii="Cambria Math" w:hAnsi="Cambria Math"/>
+                <w:i/>
+                <w:szCs w:val="28"/>
+              </w:rPr>
+            </m:ctrlPr>
+          </m:sSubPr>
+          <m:e>
+            <m:r>
+              <w:rPr>
+                <w:rFonts w:ascii="Cambria Math" w:hAnsi="Cambria Math"/>
+                <w:szCs w:val="28"/>
+              </w:rPr>
+              <m:t>A</m:t>
+            </m:r>
+          </m:e>
+          <m:sub>
+            <m:r>
+              <w:rPr>
+                <w:rFonts w:ascii="Cambria Math" w:hAnsi="Cambria Math"/>
+                <w:szCs w:val="28"/>
+              </w:rPr>
+              <m:t>pulse</m:t>
+            </m:r>
+          </m:sub>
+        </m:sSub>
+      </m:oMath>
+      <w:r>
+        <w:rPr>
+          <w:szCs w:val="28"/>
+          <w:lang w:val="ru-RU"/>
+        </w:rPr>
+        <w:t xml:space="preserve"> = 1</w:t>
+      </w:r>
+      <w:r>
+        <w:rPr>
+          <w:lang w:val="ru-RU"/>
+        </w:rPr>
+        <w:t xml:space="preserve"> </w:t>
+      </w:r>
+      <w:r>
+        <w:rPr>
+          <w:lang w:val="ru-RU"/>
+        </w:rPr>
         <w:t xml:space="preserve">изображен </w:t>
       </w:r>
       <w:r>
@@ -2834,6 +3130,12 @@
           <w:lang w:val="ru-RU"/>
         </w:rPr>
         <w:t xml:space="preserve"> рисунке 1</w:t>
+      </w:r>
+      <w:r>
+        <w:rPr>
+          <w:lang w:val="ru-RU"/>
+        </w:rPr>
+        <w:t>:</w:t>
       </w:r>
     </w:p>
     <w:p>
@@ -2894,14 +3196,14 @@
         <w:jc w:val="center"/>
         <w:rPr>
           <w:b w:val="0"/>
-          <w:sz w:val="24"/>
+          <w:szCs w:val="28"/>
           <w:lang w:val="ru-RU"/>
         </w:rPr>
       </w:pPr>
       <w:r>
         <w:rPr>
           <w:b w:val="0"/>
-          <w:sz w:val="24"/>
+          <w:szCs w:val="28"/>
           <w:lang w:val="ru-RU"/>
         </w:rPr>
         <w:t xml:space="preserve">Рисунок 1 — Импульс Лоренца с центром </w:t>
@@ -2909,14 +3211,14 @@
       <w:r>
         <w:rPr>
           <w:b w:val="0"/>
-          <w:sz w:val="24"/>
+          <w:szCs w:val="28"/>
         </w:rPr>
         <w:t>T</w:t>
       </w:r>
       <w:r>
         <w:rPr>
           <w:b w:val="0"/>
-          <w:sz w:val="24"/>
+          <w:szCs w:val="28"/>
           <w:lang w:val="ru-RU"/>
         </w:rPr>
         <w:t>/2</w:t>
@@ -3032,10 +3334,25 @@
         </w:rPr>
         <w:t xml:space="preserve">Рисунок 2 – Зашумленный импульс </w:t>
       </w:r>
+      <w:r>
+        <w:rPr>
+          <w:lang w:val="ru-RU"/>
+        </w:rPr>
+        <w:t>Лоренца</w:t>
+      </w:r>
     </w:p>
     <w:p>
       <w:pPr>
         <w:ind w:firstLine="0"/>
+        <w:jc w:val="center"/>
+        <w:rPr>
+          <w:lang w:val="ru-RU"/>
+        </w:rPr>
+      </w:pPr>
+    </w:p>
+    <w:p>
+      <w:pPr>
+        <w:ind w:firstLine="0"/>
         <w:rPr>
           <w:b/>
           <w:lang w:val="ru-RU"/>
@@ -3044,6 +3361,7 @@
       <w:r>
         <w:rPr>
           <w:b/>
+          <w:lang w:val="ru-RU"/>
         </w:rPr>
         <w:t xml:space="preserve">4. </w:t>
       </w:r>
@@ -3120,16 +3438,7 @@
           <w:sz w:val="28"/>
           <w:szCs w:val="28"/>
         </w:rPr>
-        <w:t>, тогда как импульсный сигнал обладает непрерывным спектром, который невозможно полностью охарактеризовать одной частотой. Для количественного описания спектральных свойств импул</w:t>
-      </w:r>
-      <w:bookmarkStart w:id="0" w:name="_GoBack"/>
-      <w:bookmarkEnd w:id="0"/>
-      <w:r>
-        <w:rPr>
-          <w:sz w:val="28"/>
-          <w:szCs w:val="28"/>
-        </w:rPr>
-        <w:t xml:space="preserve">ьса могут использоваться различные характеристики, в частности среднеквадратичная частота </w:t>
+        <w:t xml:space="preserve">, тогда как импульсный сигнал обладает непрерывным спектром, который невозможно полностью охарактеризовать одной частотой. Для количественного описания спектральных свойств импульса могут использоваться различные характеристики, в частности среднеквадратичная частота </w:t>
       </w:r>
       <m:oMath>
         <m:sSub>
@@ -3173,30 +3482,36 @@
         <w:spacing w:before="0" w:beforeAutospacing="0" w:after="0" w:afterAutospacing="0" w:line="360" w:lineRule="auto"/>
         <w:ind w:firstLine="720"/>
         <w:jc w:val="both"/>
+        <w:rPr>
+          <w:lang w:val="en-US"/>
+        </w:rPr>
       </w:pPr>
       <w:r>
         <w:rPr>
           <w:sz w:val="28"/>
           <w:szCs w:val="28"/>
         </w:rPr>
-        <w:t>В рамках настоящего исследования рассмотрим среднеквадратичную частоту, поскольку она учитывает распределение энергии сигнала по спектру с весом, пропорциональным квадрату частоты, и связана с чувствительностью сигнала к малым временным сдвигам. Последнее представляет интерес при исследовании системы АВП, поскольку сигналы на разных приёмниках характеризуются различными временны́ми задержками</w:t>
-      </w:r>
-      <w:r>
-        <w:t>.</w:t>
+        <w:t xml:space="preserve">В рамках настоящего исследования рассмотрим среднеквадратичную частоту, поскольку она учитывает распределение энергии сигнала по спектру с весом, пропорциональным квадрату частоты. </w:t>
+      </w:r>
+      <w:r>
+        <w:rPr>
+          <w:sz w:val="28"/>
+          <w:szCs w:val="28"/>
+        </w:rPr>
+        <w:t>Амплитудный спектр сигнала определяется выражением</w:t>
+      </w:r>
+      <w:r>
+        <w:rPr>
+          <w:sz w:val="28"/>
+          <w:szCs w:val="28"/>
+          <w:lang w:val="en-US"/>
+        </w:rPr>
+        <w:t>:</w:t>
       </w:r>
     </w:p>
     <w:p>
       <w:pPr>
         <w:ind w:firstLine="0"/>
-        <w:rPr>
-          <w:lang w:val="ru-RU"/>
-        </w:rPr>
-      </w:pPr>
-    </w:p>
-    <w:p>
-      <w:pPr>
-        <w:ind w:firstLine="0"/>
-        <w:jc w:val="center"/>
         <w:rPr>
           <w:lang w:val="ru-RU"/>
         </w:rPr>
@@ -3381,395 +3696,119 @@
       <w:pPr>
         <w:ind w:firstLine="0"/>
         <w:jc w:val="center"/>
-        <w:rPr>
-          <w:lang w:val="ru-RU"/>
-        </w:rPr>
       </w:pPr>
     </w:p>
     <w:p>
       <w:pPr>
         <w:ind w:firstLine="0"/>
-        <w:rPr>
-          <w:lang w:val="ru-RU"/>
-        </w:rPr>
+        <w:jc w:val="center"/>
       </w:pPr>
-      <m:oMathPara>
-        <m:oMath>
-          <m:eqArr>
-            <m:eqArrPr>
-              <m:maxDist m:val="1"/>
-              <m:ctrlPr>
-                <w:rPr>
-                  <w:rFonts w:ascii="Cambria Math" w:hAnsi="Cambria Math"/>
-                  <w:i/>
-                  <w:lang w:val="ru-RU"/>
-                </w:rPr>
-              </m:ctrlPr>
-            </m:eqArrPr>
-            <m:e>
-              <m:sSub>
-                <m:sSubPr>
-                  <m:ctrlPr>
-                    <w:rPr>
-                      <w:rFonts w:ascii="Cambria Math" w:hAnsi="Cambria Math"/>
-                      <w:i/>
-                      <w:lang w:val="ru-RU"/>
-                    </w:rPr>
-                  </m:ctrlPr>
-                </m:sSubPr>
-                <m:e>
-                  <m:r>
-                    <w:rPr>
-                      <w:rFonts w:ascii="Cambria Math" w:hAnsi="Cambria Math"/>
-                    </w:rPr>
-                    <m:t>f</m:t>
-                  </m:r>
-                </m:e>
-                <m:sub>
-                  <m:r>
-                    <w:rPr>
-                      <w:rFonts w:ascii="Cambria Math" w:hAnsi="Cambria Math"/>
-                    </w:rPr>
-                    <m:t>RMS</m:t>
-                  </m:r>
-                </m:sub>
-              </m:sSub>
-              <m:r>
-                <w:rPr>
-                  <w:rFonts w:ascii="Cambria Math" w:hAnsi="Cambria Math"/>
-                  <w:lang w:val="ru-RU"/>
-                </w:rPr>
-                <m:t>=</m:t>
-              </m:r>
-              <m:sSup>
-                <m:sSupPr>
-                  <m:ctrlPr>
-                    <w:rPr>
-                      <w:rFonts w:ascii="Cambria Math" w:hAnsi="Cambria Math"/>
-                      <w:i/>
-                      <w:lang w:val="ru-RU"/>
-                    </w:rPr>
-                  </m:ctrlPr>
-                </m:sSupPr>
-                <m:e>
-                  <m:d>
-                    <m:dPr>
-                      <m:begChr m:val="["/>
-                      <m:endChr m:val="]"/>
-                      <m:ctrlPr>
-                        <w:rPr>
-                          <w:rFonts w:ascii="Cambria Math" w:hAnsi="Cambria Math"/>
-                          <w:i/>
-                          <w:lang w:val="ru-RU"/>
-                        </w:rPr>
-                      </m:ctrlPr>
-                    </m:dPr>
-                    <m:e>
-                      <m:f>
-                        <m:fPr>
-                          <m:ctrlPr>
-                            <w:rPr>
-                              <w:rFonts w:ascii="Cambria Math" w:hAnsi="Cambria Math"/>
-                              <w:i/>
-                              <w:lang w:val="ru-RU"/>
-                            </w:rPr>
-                          </m:ctrlPr>
-                        </m:fPr>
-                        <m:num>
-                          <m:nary>
-                            <m:naryPr>
-                              <m:limLoc m:val="subSup"/>
-                              <m:ctrlPr>
-                                <w:rPr>
-                                  <w:rFonts w:ascii="Cambria Math" w:hAnsi="Cambria Math"/>
-                                  <w:i/>
-                                  <w:lang w:val="ru-RU"/>
-                                </w:rPr>
-                              </m:ctrlPr>
-                            </m:naryPr>
-                            <m:sub>
-                              <m:r>
-                                <w:rPr>
-                                  <w:rFonts w:ascii="Cambria Math" w:hAnsi="Cambria Math"/>
-                                  <w:lang w:val="ru-RU"/>
-                                </w:rPr>
-                                <m:t>0</m:t>
-                              </m:r>
-                            </m:sub>
-                            <m:sup>
-                              <m:r>
-                                <w:rPr>
-                                  <w:rFonts w:ascii="Cambria Math" w:hAnsi="Cambria Math"/>
-                                </w:rPr>
-                                <m:t>T</m:t>
-                              </m:r>
-                            </m:sup>
-                            <m:e>
-                              <m:r>
-                                <w:rPr>
-                                  <w:rFonts w:ascii="Cambria Math" w:hAnsi="Cambria Math"/>
-                                  <w:lang w:val="ru-RU"/>
-                                </w:rPr>
-                                <m:t>f</m:t>
-                              </m:r>
-                              <m:sSup>
-                                <m:sSupPr>
-                                  <m:ctrlPr>
-                                    <w:rPr>
-                                      <w:rFonts w:ascii="Cambria Math" w:hAnsi="Cambria Math"/>
-                                      <w:i/>
-                                    </w:rPr>
-                                  </m:ctrlPr>
-                                </m:sSupPr>
-                                <m:e>
-                                  <m:d>
-                                    <m:dPr>
-                                      <m:begChr m:val="|"/>
-                                      <m:endChr m:val="|"/>
-                                      <m:ctrlPr>
-                                        <w:rPr>
-                                          <w:rFonts w:ascii="Cambria Math" w:hAnsi="Cambria Math"/>
-                                          <w:i/>
-                                        </w:rPr>
-                                      </m:ctrlPr>
-                                    </m:dPr>
-                                    <m:e>
-                                      <m:acc>
-                                        <m:accPr>
-                                          <m:chr m:val="̃"/>
-                                          <m:ctrlPr>
-                                            <w:rPr>
-                                              <w:rFonts w:ascii="Cambria Math" w:hAnsi="Cambria Math"/>
-                                              <w:i/>
-                                            </w:rPr>
-                                          </m:ctrlPr>
-                                        </m:accPr>
-                                        <m:e>
-                                          <m:r>
-                                            <w:rPr>
-                                              <w:rFonts w:ascii="Cambria Math" w:hAnsi="Cambria Math"/>
-                                            </w:rPr>
-                                            <m:t>s</m:t>
-                                          </m:r>
-                                        </m:e>
-                                      </m:acc>
-                                      <m:d>
-                                        <m:dPr>
-                                          <m:ctrlPr>
-                                            <w:rPr>
-                                              <w:rFonts w:ascii="Cambria Math" w:hAnsi="Cambria Math"/>
-                                              <w:i/>
-                                            </w:rPr>
-                                          </m:ctrlPr>
-                                        </m:dPr>
-                                        <m:e>
-                                          <m:r>
-                                            <w:rPr>
-                                              <w:rFonts w:ascii="Cambria Math" w:hAnsi="Cambria Math"/>
-                                            </w:rPr>
-                                            <m:t>f</m:t>
-                                          </m:r>
-                                        </m:e>
-                                      </m:d>
-                                    </m:e>
-                                  </m:d>
-                                </m:e>
-                                <m:sup>
-                                  <m:r>
-                                    <w:rPr>
-                                      <w:rFonts w:ascii="Cambria Math" w:hAnsi="Cambria Math"/>
-                                    </w:rPr>
-                                    <m:t>2</m:t>
-                                  </m:r>
-                                </m:sup>
-                              </m:sSup>
-                              <m:r>
-                                <w:rPr>
-                                  <w:rFonts w:ascii="Cambria Math" w:hAnsi="Cambria Math"/>
-                                </w:rPr>
-                                <m:t>df</m:t>
-                              </m:r>
-                            </m:e>
-                          </m:nary>
-                        </m:num>
-                        <m:den>
-                          <m:nary>
-                            <m:naryPr>
-                              <m:limLoc m:val="subSup"/>
-                              <m:ctrlPr>
-                                <w:rPr>
-                                  <w:rFonts w:ascii="Cambria Math" w:hAnsi="Cambria Math"/>
-                                  <w:i/>
-                                  <w:lang w:val="ru-RU"/>
-                                </w:rPr>
-                              </m:ctrlPr>
-                            </m:naryPr>
-                            <m:sub>
-                              <m:r>
-                                <w:rPr>
-                                  <w:rFonts w:ascii="Cambria Math" w:hAnsi="Cambria Math"/>
-                                  <w:lang w:val="ru-RU"/>
-                                </w:rPr>
-                                <m:t>0</m:t>
-                              </m:r>
-                            </m:sub>
-                            <m:sup>
-                              <m:r>
-                                <w:rPr>
-                                  <w:rFonts w:ascii="Cambria Math" w:hAnsi="Cambria Math"/>
-                                </w:rPr>
-                                <m:t>T</m:t>
-                              </m:r>
-                            </m:sup>
-                            <m:e>
-                              <m:sSup>
-                                <m:sSupPr>
-                                  <m:ctrlPr>
-                                    <w:rPr>
-                                      <w:rFonts w:ascii="Cambria Math" w:hAnsi="Cambria Math"/>
-                                      <w:i/>
-                                    </w:rPr>
-                                  </m:ctrlPr>
-                                </m:sSupPr>
-                                <m:e>
-                                  <m:d>
-                                    <m:dPr>
-                                      <m:begChr m:val="|"/>
-                                      <m:endChr m:val="|"/>
-                                      <m:ctrlPr>
-                                        <w:rPr>
-                                          <w:rFonts w:ascii="Cambria Math" w:hAnsi="Cambria Math"/>
-                                          <w:i/>
-                                        </w:rPr>
-                                      </m:ctrlPr>
-                                    </m:dPr>
-                                    <m:e>
-                                      <m:acc>
-                                        <m:accPr>
-                                          <m:chr m:val="̃"/>
-                                          <m:ctrlPr>
-                                            <w:rPr>
-                                              <w:rFonts w:ascii="Cambria Math" w:hAnsi="Cambria Math"/>
-                                              <w:i/>
-                                            </w:rPr>
-                                          </m:ctrlPr>
-                                        </m:accPr>
-                                        <m:e>
-                                          <m:r>
-                                            <w:rPr>
-                                              <w:rFonts w:ascii="Cambria Math" w:hAnsi="Cambria Math"/>
-                                            </w:rPr>
-                                            <m:t>s</m:t>
-                                          </m:r>
-                                        </m:e>
-                                      </m:acc>
-                                      <m:d>
-                                        <m:dPr>
-                                          <m:ctrlPr>
-                                            <w:rPr>
-                                              <w:rFonts w:ascii="Cambria Math" w:hAnsi="Cambria Math"/>
-                                              <w:i/>
-                                            </w:rPr>
-                                          </m:ctrlPr>
-                                        </m:dPr>
-                                        <m:e>
-                                          <m:r>
-                                            <w:rPr>
-                                              <w:rFonts w:ascii="Cambria Math" w:hAnsi="Cambria Math"/>
-                                            </w:rPr>
-                                            <m:t>f</m:t>
-                                          </m:r>
-                                        </m:e>
-                                      </m:d>
-                                    </m:e>
-                                  </m:d>
-                                </m:e>
-                                <m:sup>
-                                  <m:r>
-                                    <w:rPr>
-                                      <w:rFonts w:ascii="Cambria Math" w:hAnsi="Cambria Math"/>
-                                    </w:rPr>
-                                    <m:t>2</m:t>
-                                  </m:r>
-                                </m:sup>
-                              </m:sSup>
-                              <m:r>
-                                <w:rPr>
-                                  <w:rFonts w:ascii="Cambria Math" w:hAnsi="Cambria Math"/>
-                                </w:rPr>
-                                <m:t>df</m:t>
-                              </m:r>
-                            </m:e>
-                          </m:nary>
-                        </m:den>
-                      </m:f>
-                    </m:e>
-                  </m:d>
-                </m:e>
-                <m:sup>
-                  <m:f>
-                    <m:fPr>
-                      <m:type m:val="skw"/>
-                      <m:ctrlPr>
-                        <w:rPr>
-                          <w:rFonts w:ascii="Cambria Math" w:hAnsi="Cambria Math"/>
-                          <w:i/>
-                          <w:lang w:val="ru-RU"/>
-                        </w:rPr>
-                      </m:ctrlPr>
-                    </m:fPr>
-                    <m:num>
-                      <m:r>
-                        <w:rPr>
-                          <w:rFonts w:ascii="Cambria Math" w:hAnsi="Cambria Math"/>
-                          <w:lang w:val="ru-RU"/>
-                        </w:rPr>
-                        <m:t>1</m:t>
-                      </m:r>
-                    </m:num>
-                    <m:den>
-                      <m:r>
-                        <w:rPr>
-                          <w:rFonts w:ascii="Cambria Math" w:hAnsi="Cambria Math"/>
-                          <w:lang w:val="ru-RU"/>
-                        </w:rPr>
-                        <m:t>2</m:t>
-                      </m:r>
-                    </m:den>
-                  </m:f>
-                </m:sup>
-              </m:sSup>
-              <m:r>
-                <w:rPr>
-                  <w:rFonts w:ascii="Cambria Math" w:hAnsi="Cambria Math"/>
-                  <w:lang w:val="ru-RU"/>
-                </w:rPr>
-                <m:t>#</m:t>
-              </m:r>
-              <m:d>
-                <m:dPr>
-                  <m:ctrlPr>
-                    <w:rPr>
-                      <w:rFonts w:ascii="Cambria Math" w:hAnsi="Cambria Math"/>
-                      <w:i/>
-                      <w:lang w:val="ru-RU"/>
-                    </w:rPr>
-                  </m:ctrlPr>
-                </m:dPr>
-                <m:e>
-                  <m:r>
-                    <w:rPr>
-                      <w:rFonts w:ascii="Cambria Math" w:hAnsi="Cambria Math"/>
-                      <w:lang w:val="ru-RU"/>
-                    </w:rPr>
-                    <m:t>7</m:t>
-                  </m:r>
-                </m:e>
-              </m:d>
-            </m:e>
-          </m:eqArr>
-        </m:oMath>
-      </m:oMathPara>
+    </w:p>
+    <w:p>
+      <w:pPr>
+        <w:ind w:firstLine="0"/>
+        <w:jc w:val="center"/>
+      </w:pPr>
+    </w:p>
+    <w:p>
+      <w:pPr>
+        <w:ind w:firstLine="0"/>
+        <w:jc w:val="center"/>
+      </w:pPr>
+    </w:p>
+    <w:p>
+      <w:pPr>
+        <w:ind w:firstLine="0"/>
+        <w:jc w:val="center"/>
+      </w:pPr>
+      <w:r>
+        <w:pict>
+          <v:shapetype id="_x0000_t75" coordsize="21600,21600" o:spt="75" o:preferrelative="t" path="m@4@5l@4@11@9@11@9@5xe" filled="f" stroked="f">
+            <v:stroke joinstyle="miter"/>
+            <v:formulas>
+              <v:f eqn="if lineDrawn pixelLineWidth 0"/>
+              <v:f eqn="sum @0 1 0"/>
+              <v:f eqn="sum 0 0 @1"/>
+              <v:f eqn="prod @2 1 2"/>
+              <v:f eqn="prod @3 21600 pixelWidth"/>
+              <v:f eqn="prod @3 21600 pixelHeight"/>
+              <v:f eqn="sum @0 0 1"/>
+              <v:f eqn="prod @6 1 2"/>
+              <v:f eqn="prod @7 21600 pixelWidth"/>
+              <v:f eqn="sum @8 21600 0"/>
+              <v:f eqn="prod @7 21600 pixelHeight"/>
+              <v:f eqn="sum @10 21600 0"/>
+            </v:formulas>
+            <v:path o:extrusionok="f" gradientshapeok="t" o:connecttype="rect"/>
+            <o:lock v:ext="edit" aspectratio="t"/>
+          </v:shapetype>
+          <v:shape id="_x0000_i1027" type="#_x0000_t75" style="width:467.45pt;height:233.7pt">
+            <v:imagedata r:id="rId10" o:title="Амплитудный спектр S(f)(1)"/>
+          </v:shape>
+        </w:pict>
+      </w:r>
+    </w:p>
+    <w:p>
+      <w:pPr>
+        <w:ind w:firstLine="0"/>
+        <w:jc w:val="center"/>
+        <w:rPr>
+          <w:lang w:val="ru-RU"/>
+        </w:rPr>
+      </w:pPr>
+      <w:r>
+        <w:rPr>
+          <w:lang w:val="ru-RU"/>
+        </w:rPr>
+        <w:t xml:space="preserve">Рисунок 3 – Амплитудный спектр </w:t>
+      </w:r>
+      <m:oMath>
+        <m:acc>
+          <m:accPr>
+            <m:chr m:val="̃"/>
+            <m:ctrlPr>
+              <w:rPr>
+                <w:rFonts w:ascii="Cambria Math" w:hAnsi="Cambria Math"/>
+                <w:i/>
+              </w:rPr>
+            </m:ctrlPr>
+          </m:accPr>
+          <m:e>
+            <m:r>
+              <w:rPr>
+                <w:rFonts w:ascii="Cambria Math" w:hAnsi="Cambria Math"/>
+              </w:rPr>
+              <m:t>s</m:t>
+            </m:r>
+          </m:e>
+        </m:acc>
+        <m:d>
+          <m:dPr>
+            <m:ctrlPr>
+              <w:rPr>
+                <w:rFonts w:ascii="Cambria Math" w:hAnsi="Cambria Math"/>
+                <w:i/>
+              </w:rPr>
+            </m:ctrlPr>
+          </m:dPr>
+          <m:e>
+            <m:r>
+              <w:rPr>
+                <w:rFonts w:ascii="Cambria Math" w:hAnsi="Cambria Math"/>
+              </w:rPr>
+              <m:t>f</m:t>
+            </m:r>
+          </m:e>
+        </m:d>
+      </m:oMath>
+    </w:p>
+    <w:p>
+      <w:pPr>
+        <w:ind w:firstLine="0"/>
+        <w:rPr>
+          <w:lang w:val="ru-RU"/>
+        </w:rPr>
+      </w:pPr>
     </w:p>
     <w:p>
       <w:pPr>
@@ -4379,6 +4418,7 @@
           <w:noProof/>
           <w:lang w:val="ru-RU" w:eastAsia="ru-RU"/>
         </w:rPr>
+        <w:lastRenderedPageBreak/>
         <w:drawing>
           <wp:inline distT="0" distB="0" distL="0" distR="0">
             <wp:extent cx="5903999" cy="2099200"/>
@@ -4395,7 +4435,7 @@
                     <pic:cNvPicPr/>
                   </pic:nvPicPr>
                   <pic:blipFill>
-                    <a:blip r:embed="rId10"/>
+                    <a:blip r:embed="rId11"/>
                     <a:stretch>
                       <a:fillRect/>
                     </a:stretch>
@@ -5111,102 +5151,6 @@
                     <pic:cNvPicPr/>
                   </pic:nvPicPr>
                   <pic:blipFill>
-                    <a:blip r:embed="rId11"/>
-                    <a:stretch>
-                      <a:fillRect/>
-                    </a:stretch>
-                  </pic:blipFill>
-                  <pic:spPr>
-                    <a:xfrm>
-                      <a:off x="0" y="0"/>
-                      <a:ext cx="5903999" cy="2608744"/>
-                    </a:xfrm>
-                    <a:prstGeom prst="rect">
-                      <a:avLst/>
-                    </a:prstGeom>
-                  </pic:spPr>
-                </pic:pic>
-              </a:graphicData>
-            </a:graphic>
-          </wp:inline>
-        </w:drawing>
-      </w:r>
-    </w:p>
-    <w:p>
-      <w:pPr>
-        <w:pStyle w:val="af5"/>
-        <w:jc w:val="center"/>
-        <w:rPr>
-          <w:lang w:val="ru-RU"/>
-        </w:rPr>
-      </w:pPr>
-      <w:r>
-        <w:rPr>
-          <w:lang w:val="ru-RU"/>
-        </w:rPr>
-        <w:t>Рисунок 5 — Дисперсия ошибки оценки азимута в зависимости от азимута источника, град²</w:t>
-      </w:r>
-    </w:p>
-    <w:p>
-      <w:pPr>
-        <w:pStyle w:val="21"/>
-        <w:rPr>
-          <w:lang w:val="ru-RU"/>
-        </w:rPr>
-      </w:pPr>
-      <w:r>
-        <w:rPr>
-          <w:lang w:val="ru-RU"/>
-        </w:rPr>
-        <w:lastRenderedPageBreak/>
-        <w:t>5.2 Зависимость от отношения сигнал/шум</w:t>
-      </w:r>
-    </w:p>
-    <w:p>
-      <w:pPr>
-        <w:keepNext/>
-        <w:rPr>
-          <w:lang w:val="ru-RU"/>
-        </w:rPr>
-      </w:pPr>
-      <w:r>
-        <w:t>SNR</w:t>
-      </w:r>
-      <w:r>
-        <w:rPr>
-          <w:lang w:val="ru-RU"/>
-        </w:rPr>
-        <w:t xml:space="preserve"> изменяется от 0,1 до 1 в линейной шкале. Шум нормируется по энергии импульса на интервале наблюдения, как указано в разделе 1.</w:t>
-      </w:r>
-    </w:p>
-    <w:p>
-      <w:pPr>
-        <w:keepNext/>
-        <w:spacing w:line="240" w:lineRule="auto"/>
-        <w:ind w:firstLine="0"/>
-        <w:jc w:val="center"/>
-      </w:pPr>
-      <w:r>
-        <w:rPr>
-          <w:noProof/>
-          <w:lang w:val="ru-RU" w:eastAsia="ru-RU"/>
-        </w:rPr>
-        <w:drawing>
-          <wp:inline distT="0" distB="0" distL="0" distR="0">
-            <wp:extent cx="5903999" cy="2608744"/>
-            <wp:effectExtent l="0" t="0" r="0" b="0"/>
-            <wp:docPr id="8" name="Picture 8"/>
-            <wp:cNvGraphicFramePr>
-              <a:graphicFrameLocks xmlns:a="http://schemas.openxmlformats.org/drawingml/2006/main" noChangeAspect="1"/>
-            </wp:cNvGraphicFramePr>
-            <a:graphic xmlns:a="http://schemas.openxmlformats.org/drawingml/2006/main">
-              <a:graphicData uri="http://schemas.openxmlformats.org/drawingml/2006/picture">
-                <pic:pic xmlns:pic="http://schemas.openxmlformats.org/drawingml/2006/picture">
-                  <pic:nvPicPr>
-                    <pic:cNvPr id="0" name="variance_snr.png"/>
-                    <pic:cNvPicPr/>
-                  </pic:nvPicPr>
-                  <pic:blipFill>
                     <a:blip r:embed="rId12"/>
                     <a:stretch>
                       <a:fillRect/>
@@ -5240,7 +5184,7 @@
         <w:rPr>
           <w:lang w:val="ru-RU"/>
         </w:rPr>
-        <w:t>Рисунок 6 — Дисперсия ошибки оценки азимута в зависимости от отношения сигнал/шум, град²</w:t>
+        <w:t>Рисунок 5 — Дисперсия ошибки оценки азимута в зависимости от азимута источника, град²</w:t>
       </w:r>
     </w:p>
     <w:p>
@@ -5254,7 +5198,8 @@
         <w:rPr>
           <w:lang w:val="ru-RU"/>
         </w:rPr>
-        <w:t>5.3 Зависимость от радиуса решётки</w:t>
+        <w:lastRenderedPageBreak/>
+        <w:t>5.2 Зависимость от отношения сигнал/шум</w:t>
       </w:r>
     </w:p>
     <w:p>
@@ -5265,19 +5210,13 @@
         </w:rPr>
       </w:pPr>
       <w:r>
-        <w:rPr>
-          <w:lang w:val="ru-RU"/>
-        </w:rPr>
-        <w:t xml:space="preserve">Радиус решётки изменяется от 1 до 10 м. Задержки сигналов пересчитываются для каждого радиуса; форма импульса и длительность </w:t>
-      </w:r>
-      <w:r>
-        <w:t>τ</w:t>
-      </w:r>
-      <w:r>
-        <w:rPr>
-          <w:lang w:val="ru-RU"/>
-        </w:rPr>
-        <w:t xml:space="preserve"> сохраняются. Используется направляющий вектор из исходной модели, без компенсации междатчиковых задержек.</w:t>
+        <w:t>SNR</w:t>
+      </w:r>
+      <w:r>
+        <w:rPr>
+          <w:lang w:val="ru-RU"/>
+        </w:rPr>
+        <w:t xml:space="preserve"> изменяется от 0,1 до 1 в линейной шкале. Шум нормируется по энергии импульса на интервале наблюдения, как указано в разделе 1.</w:t>
       </w:r>
     </w:p>
     <w:p>
@@ -5296,7 +5235,7 @@
           <wp:inline distT="0" distB="0" distL="0" distR="0">
             <wp:extent cx="5903999" cy="2608744"/>
             <wp:effectExtent l="0" t="0" r="0" b="0"/>
-            <wp:docPr id="9" name="Picture 9"/>
+            <wp:docPr id="8" name="Picture 8"/>
             <wp:cNvGraphicFramePr>
               <a:graphicFrameLocks xmlns:a="http://schemas.openxmlformats.org/drawingml/2006/main" noChangeAspect="1"/>
             </wp:cNvGraphicFramePr>
@@ -5304,7 +5243,7 @@
               <a:graphicData uri="http://schemas.openxmlformats.org/drawingml/2006/picture">
                 <pic:pic xmlns:pic="http://schemas.openxmlformats.org/drawingml/2006/picture">
                   <pic:nvPicPr>
-                    <pic:cNvPr id="0" name="variance_radius.png"/>
+                    <pic:cNvPr id="0" name="variance_snr.png"/>
                     <pic:cNvPicPr/>
                   </pic:nvPicPr>
                   <pic:blipFill>
@@ -5341,7 +5280,7 @@
         <w:rPr>
           <w:lang w:val="ru-RU"/>
         </w:rPr>
-        <w:t>Рисунок 7 — Дисперсия ошибки оценки азимута в зависимости от радиуса решётки, град²</w:t>
+        <w:t>Рисунок 6 — Дисперсия ошибки оценки азимута в зависимости от отношения сигнал/шум, град²</w:t>
       </w:r>
     </w:p>
     <w:p>
@@ -5355,8 +5294,7 @@
         <w:rPr>
           <w:lang w:val="ru-RU"/>
         </w:rPr>
-        <w:lastRenderedPageBreak/>
-        <w:t>5.4 Зависимость от количества датчиков</w:t>
+        <w:t>5.3 Зависимость от радиуса решётки</w:t>
       </w:r>
     </w:p>
     <w:p>
@@ -5370,34 +5308,16 @@
         <w:rPr>
           <w:lang w:val="ru-RU"/>
         </w:rPr>
-        <w:t xml:space="preserve">Количество датчиков принимает значения 1, 5, 7, 10, 12, 15, 17 и 20. Радиус, </w:t>
-      </w:r>
-      <w:r>
-        <w:t>SNR</w:t>
-      </w:r>
-      <w:r>
-        <w:rPr>
-          <w:lang w:val="ru-RU"/>
-        </w:rPr>
-        <w:t xml:space="preserve"> и длительность импульса сохраняются. Размер матрицы наблюдений составляет 3</w:t>
-      </w:r>
-      <w:r>
-        <w:t>M</w:t>
-      </w:r>
-      <w:r>
-        <w:rPr>
-          <w:lang w:val="ru-RU"/>
-        </w:rPr>
-        <w:t xml:space="preserve"> × </w:t>
-      </w:r>
-      <w:r>
-        <w:t>N</w:t>
-      </w:r>
-      <w:r>
-        <w:rPr>
-          <w:lang w:val="ru-RU"/>
-        </w:rPr>
-        <w:t>.</w:t>
+        <w:t xml:space="preserve">Радиус решётки изменяется от 1 до 10 м. Задержки сигналов пересчитываются для каждого радиуса; форма импульса и длительность </w:t>
+      </w:r>
+      <w:r>
+        <w:t>τ</w:t>
+      </w:r>
+      <w:r>
+        <w:rPr>
+          <w:lang w:val="ru-RU"/>
+        </w:rPr>
+        <w:t xml:space="preserve"> сохраняются. Используется направляющий вектор из исходной модели, без компенсации междатчиковых задержек.</w:t>
       </w:r>
     </w:p>
     <w:p>
@@ -5416,7 +5336,7 @@
           <wp:inline distT="0" distB="0" distL="0" distR="0">
             <wp:extent cx="5903999" cy="2608744"/>
             <wp:effectExtent l="0" t="0" r="0" b="0"/>
-            <wp:docPr id="10" name="Picture 10"/>
+            <wp:docPr id="9" name="Picture 9"/>
             <wp:cNvGraphicFramePr>
               <a:graphicFrameLocks xmlns:a="http://schemas.openxmlformats.org/drawingml/2006/main" noChangeAspect="1"/>
             </wp:cNvGraphicFramePr>
@@ -5424,7 +5344,7 @@
               <a:graphicData uri="http://schemas.openxmlformats.org/drawingml/2006/picture">
                 <pic:pic xmlns:pic="http://schemas.openxmlformats.org/drawingml/2006/picture">
                   <pic:nvPicPr>
-                    <pic:cNvPr id="0" name="variance_sensors.png"/>
+                    <pic:cNvPr id="0" name="variance_radius.png"/>
                     <pic:cNvPicPr/>
                   </pic:nvPicPr>
                   <pic:blipFill>
@@ -5461,11 +5381,131 @@
         <w:rPr>
           <w:lang w:val="ru-RU"/>
         </w:rPr>
+        <w:t>Рисунок 7 — Дисперсия ошибки оценки азимута в зависимости от радиуса решётки, град²</w:t>
+      </w:r>
+    </w:p>
+    <w:p>
+      <w:pPr>
+        <w:pStyle w:val="21"/>
+        <w:rPr>
+          <w:lang w:val="ru-RU"/>
+        </w:rPr>
+      </w:pPr>
+      <w:r>
+        <w:rPr>
+          <w:lang w:val="ru-RU"/>
+        </w:rPr>
+        <w:lastRenderedPageBreak/>
+        <w:t>5.4 Зависимость от количества датчиков</w:t>
+      </w:r>
+    </w:p>
+    <w:p>
+      <w:pPr>
+        <w:keepNext/>
+        <w:rPr>
+          <w:lang w:val="ru-RU"/>
+        </w:rPr>
+      </w:pPr>
+      <w:r>
+        <w:rPr>
+          <w:lang w:val="ru-RU"/>
+        </w:rPr>
+        <w:t xml:space="preserve">Количество датчиков принимает значения 1, 5, 7, 10, 12, 15, 17 и 20. Радиус, </w:t>
+      </w:r>
+      <w:r>
+        <w:t>SNR</w:t>
+      </w:r>
+      <w:r>
+        <w:rPr>
+          <w:lang w:val="ru-RU"/>
+        </w:rPr>
+        <w:t xml:space="preserve"> и длительность импульса сохраняются. Размер матрицы наблюдений составляет 3</w:t>
+      </w:r>
+      <w:r>
+        <w:t>M</w:t>
+      </w:r>
+      <w:r>
+        <w:rPr>
+          <w:lang w:val="ru-RU"/>
+        </w:rPr>
+        <w:t xml:space="preserve"> × </w:t>
+      </w:r>
+      <w:r>
+        <w:t>N</w:t>
+      </w:r>
+      <w:r>
+        <w:rPr>
+          <w:lang w:val="ru-RU"/>
+        </w:rPr>
+        <w:t>.</w:t>
+      </w:r>
+    </w:p>
+    <w:p>
+      <w:pPr>
+        <w:keepNext/>
+        <w:spacing w:line="240" w:lineRule="auto"/>
+        <w:ind w:firstLine="0"/>
+        <w:jc w:val="center"/>
+      </w:pPr>
+      <w:r>
+        <w:rPr>
+          <w:noProof/>
+          <w:lang w:val="ru-RU" w:eastAsia="ru-RU"/>
+        </w:rPr>
+        <w:drawing>
+          <wp:inline distT="0" distB="0" distL="0" distR="0">
+            <wp:extent cx="5903999" cy="2608744"/>
+            <wp:effectExtent l="0" t="0" r="0" b="0"/>
+            <wp:docPr id="10" name="Picture 10"/>
+            <wp:cNvGraphicFramePr>
+              <a:graphicFrameLocks xmlns:a="http://schemas.openxmlformats.org/drawingml/2006/main" noChangeAspect="1"/>
+            </wp:cNvGraphicFramePr>
+            <a:graphic xmlns:a="http://schemas.openxmlformats.org/drawingml/2006/main">
+              <a:graphicData uri="http://schemas.openxmlformats.org/drawingml/2006/picture">
+                <pic:pic xmlns:pic="http://schemas.openxmlformats.org/drawingml/2006/picture">
+                  <pic:nvPicPr>
+                    <pic:cNvPr id="0" name="variance_sensors.png"/>
+                    <pic:cNvPicPr/>
+                  </pic:nvPicPr>
+                  <pic:blipFill>
+                    <a:blip r:embed="rId15"/>
+                    <a:stretch>
+                      <a:fillRect/>
+                    </a:stretch>
+                  </pic:blipFill>
+                  <pic:spPr>
+                    <a:xfrm>
+                      <a:off x="0" y="0"/>
+                      <a:ext cx="5903999" cy="2608744"/>
+                    </a:xfrm>
+                    <a:prstGeom prst="rect">
+                      <a:avLst/>
+                    </a:prstGeom>
+                  </pic:spPr>
+                </pic:pic>
+              </a:graphicData>
+            </a:graphic>
+          </wp:inline>
+        </w:drawing>
+      </w:r>
+    </w:p>
+    <w:p>
+      <w:pPr>
+        <w:pStyle w:val="af5"/>
+        <w:jc w:val="center"/>
+        <w:rPr>
+          <w:lang w:val="ru-RU"/>
+        </w:rPr>
+      </w:pPr>
+      <w:r>
+        <w:rPr>
+          <w:lang w:val="ru-RU"/>
+        </w:rPr>
         <w:t>Рисунок 8 — Дисперсия ошибки оценки азимута в зависимости от количества датчиков, град²</w:t>
       </w:r>
     </w:p>
     <w:sectPr>
-      <w:footerReference w:type="default" r:id="rId15"/>
+      <w:footerReference w:type="default" r:id="rId16"/>
       <w:pgSz w:w="11906" w:h="16838"/>
       <w:pgMar w:top="1134" w:right="850" w:bottom="1134" w:left="1701" w:header="709" w:footer="709" w:gutter="0"/>
       <w:cols w:space="720"/>
@@ -5521,7 +5561,7 @@
       <w:rPr>
         <w:noProof/>
       </w:rPr>
-      <w:t>5</w:t>
+      <w:t>1</w:t>
     </w:r>
     <w:r>
       <w:fldChar w:fldCharType="end"/>
@@ -17506,7 +17546,7 @@
 </file>
 
 <file path=customXml/itemProps1.xml><?xml version="1.0" encoding="utf-8"?>
-<ds:datastoreItem xmlns:ds="http://schemas.openxmlformats.org/officeDocument/2006/customXml" ds:itemID="{7DB062CD-6216-44E0-B940-B7D1475B652B}">
+<ds:datastoreItem xmlns:ds="http://schemas.openxmlformats.org/officeDocument/2006/customXml" ds:itemID="{3F9BF0E7-F492-4DDF-84D2-E48F7B26DE40}">
   <ds:schemaRefs>
     <ds:schemaRef ds:uri="http://schemas.openxmlformats.org/officeDocument/2006/bibliography"/>
   </ds:schemaRefs>

</xml_diff>